<commit_message>
Implement Phase N: IITPAVE Production Mode
</commit_message>
<xml_diff>
--- a/build/smoke_stabilized_combined.docx
+++ b/build/smoke_stabilized_combined.docx
@@ -472,7 +472,7 @@
                 <w:b w:val="0"/>
                 <w:sz w:val="20"/>
               </w:rPr>
-              <w:t>2026-06-23 01:12:15</w:t>
+              <w:t>2026-06-23 01:50:25</w:t>
             </w:r>
           </w:p>
         </w:tc>
@@ -552,7 +552,7 @@
                 <w:b w:val="0"/>
                 <w:sz w:val="20"/>
               </w:rPr>
-              <w:t>212</w:t>
+              <w:t>214</w:t>
             </w:r>
           </w:p>
         </w:tc>

</xml_diff>